<commit_message>
Kelly travel plan: audit-clean, all three polish findings fixed pre-delivery
- icons_template.js: nutritionBlock() no longer renders degenerate ranges
  (110-110g/day -> 110g/day) when a protein tier's endpoints coincide;
  range tiers verified unchanged via regenerate-and-diff (Elizabeth Poyner)
- Travel plan: Friday heavy row tightened to 35-37.5 lbs (top of old range
  exceeded estimated max at prescribed reps/RIR); referent-less '3RM range'
  goblet-squat phrase reworded in both travel and studio scripts
- All four Kelly documents regenerated and verified; CLIENTS.md audit
  record added

Co-Authored-By: Claude Fable 5 <noreply@anthropic.com>
Claude-Session: https://claude.ai/code/session_01VTRA12TAy4P16NRVKS4SK5
</commit_message>
<xml_diff>
--- a/clients/kelly_mulroy/Kelly_Mulroy_5Day_Training_Plan.docx
+++ b/clients/kelly_mulroy/Kelly_Mulroy_5Day_Training_Plan.docx
@@ -2004,7 +2004,7 @@
           <w:sz w:val="20"/>
           <w:szCs w:val="20"/>
         </w:rPr>
-        <w:t xml:space="preserve">110–110g/day</w:t>
+        <w:t xml:space="preserve">110g/day</w:t>
       </w:r>
       <w:r>
         <w:rPr>
@@ -2013,7 +2013,7 @@
           <w:sz w:val="15"/>
           <w:szCs w:val="15"/>
         </w:rPr>
-        <w:t xml:space="preserve">  (1.6–1.6 g/kg — active women general tier)  </w:t>
+        <w:t xml:space="preserve">  (1.6 g/kg — active women general tier)  </w:t>
       </w:r>
       <w:r>
         <w:rPr>
@@ -3539,7 +3539,7 @@
           <w:sz w:val="17"/>
           <w:szCs w:val="17"/>
         </w:rPr>
-        <w:t xml:space="preserve">60% day. Goblet squat at 30–35 lbs (below the 3RM range — focus is form, not load). Box squat at 40–45 lbs. Technique must be clean before load increases Thursday and Friday.</w:t>
+        <w:t xml:space="preserve">60% day. Goblet squat at 30–35 lbs (deliberately light — focus is form, not load). Box squat at 40–45 lbs. Technique must be clean before load increases Thursday and Friday.</w:t>
       </w:r>
     </w:p>
     <w:tbl>

</xml_diff>